<commit_message>
Completed Phase 3 forensic analysis and report.
</commit_message>
<xml_diff>
--- a/Forensic Acquisition Report - Phase 2.docx
+++ b/Forensic Acquisition Report - Phase 2.docx
@@ -401,14 +401,7 @@
         <w:rPr>
           <w:rFonts w:ascii="Times New Roman" w:hAnsi="Times New Roman" w:cs="Times New Roman"/>
         </w:rPr>
-        <w:t xml:space="preserve">and </w:t>
-      </w:r>
-      <w:proofErr w:type="spellStart"/>
-      <w:r>
-        <w:rPr>
-          <w:rFonts w:ascii="Times New Roman" w:hAnsi="Times New Roman" w:cs="Times New Roman"/>
-        </w:rPr>
-        <w:t>WinP</w:t>
+        <w:t>and WinP</w:t>
       </w:r>
       <w:r>
         <w:rPr>
@@ -416,7 +409,6 @@
         </w:rPr>
         <w:t>mem</w:t>
       </w:r>
-      <w:proofErr w:type="spellEnd"/>
       <w:r>
         <w:rPr>
           <w:rFonts w:ascii="Times New Roman" w:hAnsi="Times New Roman" w:cs="Times New Roman"/>
@@ -448,13 +440,7 @@
         <w:rPr>
           <w:rFonts w:ascii="Times New Roman" w:hAnsi="Times New Roman" w:cs="Times New Roman"/>
         </w:rPr>
-        <w:t>Step By Step</w:t>
-      </w:r>
-      <w:r>
-        <w:rPr>
-          <w:rFonts w:ascii="Times New Roman" w:hAnsi="Times New Roman" w:cs="Times New Roman"/>
-        </w:rPr>
-        <w:t xml:space="preserve"> </w:t>
+        <w:t xml:space="preserve">Step By Step </w:t>
       </w:r>
       <w:r>
         <w:rPr>
@@ -543,10 +529,10 @@
         </w:rPr>
         <w:lastRenderedPageBreak/>
         <w:drawing>
-          <wp:inline distT="0" distB="0" distL="0" distR="0" wp14:anchorId="72E7782F" wp14:editId="0142682F">
-            <wp:extent cx="5943600" cy="2359025"/>
-            <wp:effectExtent l="0" t="0" r="0" b="3175"/>
-            <wp:docPr id="846041857" name="Picture 1"/>
+          <wp:inline distT="0" distB="0" distL="0" distR="0" wp14:anchorId="4292B28D" wp14:editId="1769E6B6">
+            <wp:extent cx="5943600" cy="3332480"/>
+            <wp:effectExtent l="0" t="0" r="0" b="1270"/>
+            <wp:docPr id="799846138" name="Picture 1"/>
             <wp:cNvGraphicFramePr>
               <a:graphicFrameLocks xmlns:a="http://schemas.openxmlformats.org/drawingml/2006/main" noChangeAspect="1"/>
             </wp:cNvGraphicFramePr>
@@ -554,7 +540,7 @@
               <a:graphicData uri="http://schemas.openxmlformats.org/drawingml/2006/picture">
                 <pic:pic xmlns:pic="http://schemas.openxmlformats.org/drawingml/2006/picture">
                   <pic:nvPicPr>
-                    <pic:cNvPr id="846041857" name=""/>
+                    <pic:cNvPr id="799846138" name=""/>
                     <pic:cNvPicPr/>
                   </pic:nvPicPr>
                   <pic:blipFill>
@@ -566,7 +552,7 @@
                   <pic:spPr>
                     <a:xfrm>
                       <a:off x="0" y="0"/>
-                      <a:ext cx="5943600" cy="2359025"/>
+                      <a:ext cx="5943600" cy="3332480"/>
                     </a:xfrm>
                     <a:prstGeom prst="rect">
                       <a:avLst/>
@@ -591,7 +577,13 @@
         <w:rPr>
           <w:rFonts w:ascii="Times New Roman" w:hAnsi="Times New Roman" w:cs="Times New Roman"/>
         </w:rPr>
-        <w:t>Image File: Image.ad1</w:t>
+        <w:t xml:space="preserve">Image File: </w:t>
+      </w:r>
+      <w:r>
+        <w:rPr>
+          <w:rFonts w:ascii="Times New Roman" w:hAnsi="Times New Roman" w:cs="Times New Roman"/>
+        </w:rPr>
+        <w:t>Image.ad1</w:t>
       </w:r>
     </w:p>
     <w:p>
@@ -606,13 +598,13 @@
         <w:rPr>
           <w:rFonts w:ascii="Times New Roman" w:hAnsi="Times New Roman" w:cs="Times New Roman"/>
         </w:rPr>
-        <w:t>Hash Value: c1</w:t>
-      </w:r>
-      <w:r>
-        <w:rPr>
-          <w:rFonts w:ascii="Times New Roman" w:hAnsi="Times New Roman" w:cs="Times New Roman"/>
-        </w:rPr>
-        <w:t>3873ac5f81932d3f4118454c012bc4642187827a1784f03cefcb41b25c0</w:t>
+        <w:t xml:space="preserve">Hash Value: </w:t>
+      </w:r>
+      <w:r>
+        <w:rPr>
+          <w:rFonts w:ascii="Times New Roman" w:hAnsi="Times New Roman" w:cs="Times New Roman"/>
+        </w:rPr>
+        <w:t>c13873ac5f81932d3f4118454c012bc4642187828a17f1784f03cefcb41b25c0</w:t>
       </w:r>
     </w:p>
     <w:p>
@@ -642,21 +634,7 @@
         <w:rPr>
           <w:rFonts w:ascii="Times New Roman" w:hAnsi="Times New Roman" w:cs="Times New Roman"/>
         </w:rPr>
-        <w:t>Storage Location: /home/</w:t>
-      </w:r>
-      <w:proofErr w:type="spellStart"/>
-      <w:r>
-        <w:rPr>
-          <w:rFonts w:ascii="Times New Roman" w:hAnsi="Times New Roman" w:cs="Times New Roman"/>
-        </w:rPr>
-        <w:t>wendel</w:t>
-      </w:r>
-      <w:proofErr w:type="spellEnd"/>
-      <w:r>
-        <w:rPr>
-          <w:rFonts w:ascii="Times New Roman" w:hAnsi="Times New Roman" w:cs="Times New Roman"/>
-        </w:rPr>
-        <w:t>/evidence</w:t>
+        <w:t>Storage Location: /home/wendel/evidence</w:t>
       </w:r>
     </w:p>
     <w:p>
@@ -686,21 +664,7 @@
         <w:rPr>
           <w:rFonts w:ascii="Times New Roman" w:hAnsi="Times New Roman" w:cs="Times New Roman"/>
         </w:rPr>
-        <w:t xml:space="preserve">Memory acquisition was done on the Windows local host and capture volatile data using the </w:t>
-      </w:r>
-      <w:proofErr w:type="spellStart"/>
-      <w:r>
-        <w:rPr>
-          <w:rFonts w:ascii="Times New Roman" w:hAnsi="Times New Roman" w:cs="Times New Roman"/>
-        </w:rPr>
-        <w:t>WinPMEM</w:t>
-      </w:r>
-      <w:proofErr w:type="spellEnd"/>
-      <w:r>
-        <w:rPr>
-          <w:rFonts w:ascii="Times New Roman" w:hAnsi="Times New Roman" w:cs="Times New Roman"/>
-        </w:rPr>
-        <w:t xml:space="preserve"> tool. </w:t>
+        <w:t xml:space="preserve">Memory acquisition was done on the Windows local host and capture volatile data using the WinPMEM tool. </w:t>
       </w:r>
     </w:p>
     <w:p>
@@ -714,6 +678,7 @@
       <w:r>
         <w:rPr>
           <w:rFonts w:ascii="Times New Roman" w:hAnsi="Times New Roman" w:cs="Times New Roman"/>
+          <w:noProof/>
         </w:rPr>
         <w:lastRenderedPageBreak/>
         <w:drawing>
@@ -763,6 +728,7 @@
       <w:r>
         <w:rPr>
           <w:rFonts w:ascii="Times New Roman" w:hAnsi="Times New Roman" w:cs="Times New Roman"/>
+          <w:noProof/>
         </w:rPr>
         <w:lastRenderedPageBreak/>
         <w:drawing>
@@ -812,6 +778,7 @@
       <w:r>
         <w:rPr>
           <w:rFonts w:ascii="Times New Roman" w:hAnsi="Times New Roman" w:cs="Times New Roman"/>
+          <w:noProof/>
         </w:rPr>
         <w:lastRenderedPageBreak/>
         <w:drawing>
@@ -860,16 +827,8 @@
         <w:rPr>
           <w:rFonts w:ascii="Times New Roman" w:hAnsi="Times New Roman" w:cs="Times New Roman"/>
         </w:rPr>
-        <w:t xml:space="preserve">Memory Dump File: </w:t>
-      </w:r>
-      <w:proofErr w:type="spellStart"/>
-      <w:r>
-        <w:rPr>
-          <w:rFonts w:ascii="Times New Roman" w:hAnsi="Times New Roman" w:cs="Times New Roman"/>
-        </w:rPr>
-        <w:t>physmem.raw</w:t>
-      </w:r>
-      <w:proofErr w:type="spellEnd"/>
+        <w:t>Memory Dump File: physmem.raw</w:t>
+      </w:r>
     </w:p>
     <w:p>
       <w:pPr>
@@ -928,30 +887,8 @@
         <w:rPr>
           <w:rFonts w:ascii="Times New Roman" w:hAnsi="Times New Roman" w:cs="Times New Roman"/>
         </w:rPr>
-        <w:t>Storage Location: /home/</w:t>
-      </w:r>
-      <w:proofErr w:type="spellStart"/>
-      <w:r>
-        <w:rPr>
-          <w:rFonts w:ascii="Times New Roman" w:hAnsi="Times New Roman" w:cs="Times New Roman"/>
-        </w:rPr>
-        <w:t>wendel</w:t>
-      </w:r>
-      <w:proofErr w:type="spellEnd"/>
-      <w:r>
-        <w:rPr>
-          <w:rFonts w:ascii="Times New Roman" w:hAnsi="Times New Roman" w:cs="Times New Roman"/>
-        </w:rPr>
-        <w:t>/evidence/</w:t>
-      </w:r>
-      <w:proofErr w:type="spellStart"/>
-      <w:r>
-        <w:rPr>
-          <w:rFonts w:ascii="Times New Roman" w:hAnsi="Times New Roman" w:cs="Times New Roman"/>
-        </w:rPr>
-        <w:t>physmem.raw</w:t>
-      </w:r>
-      <w:proofErr w:type="spellEnd"/>
+        <w:t>Storage Location: /home/wendel/evidence/physmem.raw</w:t>
+      </w:r>
     </w:p>
     <w:p>
       <w:pPr>
@@ -1007,6 +944,7 @@
           <w:b/>
           <w:bCs/>
         </w:rPr>
+        <w:lastRenderedPageBreak/>
         <w:t>Storage Limitations</w:t>
       </w:r>
       <w:r>
@@ -1019,21 +957,13 @@
         <w:rPr>
           <w:rFonts w:ascii="Times New Roman" w:hAnsi="Times New Roman" w:cs="Times New Roman"/>
         </w:rPr>
-        <w:t xml:space="preserve">Full disk imaging wasn’t possible due to a lack of </w:t>
-      </w:r>
-      <w:proofErr w:type="gramStart"/>
-      <w:r>
-        <w:rPr>
-          <w:rFonts w:ascii="Times New Roman" w:hAnsi="Times New Roman" w:cs="Times New Roman"/>
-        </w:rPr>
-        <w:t>storage</w:t>
-      </w:r>
-      <w:proofErr w:type="gramEnd"/>
-      <w:r>
-        <w:rPr>
-          <w:rFonts w:ascii="Times New Roman" w:hAnsi="Times New Roman" w:cs="Times New Roman"/>
-        </w:rPr>
-        <w:t xml:space="preserve"> so I created an image of the specific folder containing all the suspicious information. </w:t>
+        <w:t>Full disk imaging wasn’t possible due to a lack of storage so I created an image of the specific folder containing all the suspicious information</w:t>
+      </w:r>
+      <w:r>
+        <w:rPr>
+          <w:rFonts w:ascii="Times New Roman" w:hAnsi="Times New Roman" w:cs="Times New Roman"/>
+        </w:rPr>
+        <w:t>, then converted it into an image disk.</w:t>
       </w:r>
     </w:p>
     <w:p>
@@ -1054,7 +984,6 @@
           <w:b/>
           <w:bCs/>
         </w:rPr>
-        <w:lastRenderedPageBreak/>
         <w:t>File Transfer</w:t>
       </w:r>
       <w:r>
@@ -1215,7 +1144,7 @@
         <w:rPr>
           <w:rFonts w:ascii="Times New Roman" w:hAnsi="Times New Roman" w:cs="Times New Roman"/>
         </w:rPr>
-        <w:t>c13873ac5f81932d3f4118454c012bc4642187827a1784f03cefcb41b25c0</w:t>
+        <w:t>c13873ac5f81932d3f4118454c012bc4642187828a17f1784f03cefcb41b25c0</w:t>
       </w:r>
     </w:p>
     <w:p>
@@ -1234,27 +1163,7 @@
         <w:rPr>
           <w:rFonts w:ascii="Times New Roman" w:hAnsi="Times New Roman" w:cs="Times New Roman"/>
         </w:rPr>
-        <w:t xml:space="preserve">Storage Location: </w:t>
-      </w:r>
-      <w:r>
-        <w:rPr>
-          <w:rFonts w:ascii="Times New Roman" w:hAnsi="Times New Roman" w:cs="Times New Roman"/>
-        </w:rPr>
-        <w:t>/home/</w:t>
-      </w:r>
-      <w:proofErr w:type="spellStart"/>
-      <w:r>
-        <w:rPr>
-          <w:rFonts w:ascii="Times New Roman" w:hAnsi="Times New Roman" w:cs="Times New Roman"/>
-        </w:rPr>
-        <w:t>wendel</w:t>
-      </w:r>
-      <w:proofErr w:type="spellEnd"/>
-      <w:r>
-        <w:rPr>
-          <w:rFonts w:ascii="Times New Roman" w:hAnsi="Times New Roman" w:cs="Times New Roman"/>
-        </w:rPr>
-        <w:t>/evidence</w:t>
+        <w:t>Storage Location: /home/wendel/evidence</w:t>
       </w:r>
     </w:p>
     <w:p>
@@ -1351,13 +1260,7 @@
         <w:rPr>
           <w:rFonts w:ascii="Times New Roman" w:hAnsi="Times New Roman" w:cs="Times New Roman"/>
         </w:rPr>
-        <w:t xml:space="preserve">Hash: </w:t>
-      </w:r>
-      <w:r>
-        <w:rPr>
-          <w:rFonts w:ascii="Times New Roman" w:hAnsi="Times New Roman" w:cs="Times New Roman"/>
-        </w:rPr>
-        <w:t>f29035292d47d3f667ee7411f7e0a9226589dc1440538cd74c3bcc23902f3994</w:t>
+        <w:t>Hash: f29035292d47d3f667ee7411f7e0a9226589dc1440538cd74c3bcc23902f3994</w:t>
       </w:r>
     </w:p>
     <w:p>
@@ -1376,36 +1279,8 @@
         <w:rPr>
           <w:rFonts w:ascii="Times New Roman" w:hAnsi="Times New Roman" w:cs="Times New Roman"/>
         </w:rPr>
-        <w:t xml:space="preserve">Storage Location: </w:t>
-      </w:r>
-      <w:r>
-        <w:rPr>
-          <w:rFonts w:ascii="Times New Roman" w:hAnsi="Times New Roman" w:cs="Times New Roman"/>
-        </w:rPr>
-        <w:t>/home/</w:t>
-      </w:r>
-      <w:proofErr w:type="spellStart"/>
-      <w:r>
-        <w:rPr>
-          <w:rFonts w:ascii="Times New Roman" w:hAnsi="Times New Roman" w:cs="Times New Roman"/>
-        </w:rPr>
-        <w:t>wendel</w:t>
-      </w:r>
-      <w:proofErr w:type="spellEnd"/>
-      <w:r>
-        <w:rPr>
-          <w:rFonts w:ascii="Times New Roman" w:hAnsi="Times New Roman" w:cs="Times New Roman"/>
-        </w:rPr>
-        <w:t>/evidence/</w:t>
-      </w:r>
-      <w:proofErr w:type="spellStart"/>
-      <w:r>
-        <w:rPr>
-          <w:rFonts w:ascii="Times New Roman" w:hAnsi="Times New Roman" w:cs="Times New Roman"/>
-        </w:rPr>
-        <w:t>physmem.raw</w:t>
-      </w:r>
-      <w:proofErr w:type="spellEnd"/>
+        <w:t>Storage Location: /home/wendel/evidence/physmem.raw</w:t>
+      </w:r>
     </w:p>
     <w:p>
       <w:pPr>
@@ -1458,7 +1333,14 @@
         <w:rPr>
           <w:rFonts w:ascii="Times New Roman" w:hAnsi="Times New Roman" w:cs="Times New Roman"/>
         </w:rPr>
-        <w:t xml:space="preserve"> showcased how investigators collect both types of memory. One of the major takeaways from this phase was</w:t>
+        <w:t xml:space="preserve"> showcased how investigators collect both types of </w:t>
+      </w:r>
+      <w:r>
+        <w:rPr>
+          <w:rFonts w:ascii="Times New Roman" w:hAnsi="Times New Roman" w:cs="Times New Roman"/>
+        </w:rPr>
+        <w:lastRenderedPageBreak/>
+        <w:t>memory. One of the major takeaways from this phase was</w:t>
       </w:r>
       <w:r>
         <w:rPr>
@@ -3135,6 +3017,23 @@
 </file>
 
 <file path=customXml/item1.xml><?xml version="1.0" encoding="utf-8"?>
+<p:properties xmlns:p="http://schemas.microsoft.com/office/2006/metadata/properties" xmlns:xsi="http://www.w3.org/2001/XMLSchema-instance" xmlns:pc="http://schemas.microsoft.com/office/infopath/2007/PartnerControls">
+  <documentManagement>
+    <_activity xmlns="8b9e189a-44c8-475e-b768-20dcf1967d90" xsi:nil="true"/>
+  </documentManagement>
+</p:properties>
+</file>
+
+<file path=customXml/item2.xml><?xml version="1.0" encoding="utf-8"?>
+<?mso-contentType ?>
+<FormTemplates xmlns="http://schemas.microsoft.com/sharepoint/v3/contenttype/forms">
+  <Display>DocumentLibraryForm</Display>
+  <Edit>DocumentLibraryForm</Edit>
+  <New>DocumentLibraryForm</New>
+</FormTemplates>
+</file>
+
+<file path=customXml/item3.xml><?xml version="1.0" encoding="utf-8"?>
 <ct:contentTypeSchema xmlns:ct="http://schemas.microsoft.com/office/2006/metadata/contentType" xmlns:ma="http://schemas.microsoft.com/office/2006/metadata/properties/metaAttributes" ct:_="" ma:_="" ma:contentTypeName="Document" ma:contentTypeID="0x0101006E8AFAA3A33C78418C8B25D8C318AEE8" ma:contentTypeVersion="10" ma:contentTypeDescription="Create a new document." ma:contentTypeScope="" ma:versionID="7820c61571d969bd8868e2dec9ad134a">
   <xsd:schema xmlns:xsd="http://www.w3.org/2001/XMLSchema" xmlns:xs="http://www.w3.org/2001/XMLSchema" xmlns:p="http://schemas.microsoft.com/office/2006/metadata/properties" xmlns:ns3="8b9e189a-44c8-475e-b768-20dcf1967d90" targetNamespace="http://schemas.microsoft.com/office/2006/metadata/properties" ma:root="true" ma:fieldsID="5927b057c35c0cda6c852cfa434a42d4" ns3:_="">
     <xsd:import namespace="8b9e189a-44c8-475e-b768-20dcf1967d90"/>
@@ -3316,24 +3215,25 @@
 </ct:contentTypeSchema>
 </file>
 
-<file path=customXml/item2.xml><?xml version="1.0" encoding="utf-8"?>
-<?mso-contentType ?>
-<FormTemplates xmlns="http://schemas.microsoft.com/sharepoint/v3/contenttype/forms">
-  <Display>DocumentLibraryForm</Display>
-  <Edit>DocumentLibraryForm</Edit>
-  <New>DocumentLibraryForm</New>
-</FormTemplates>
+<file path=customXml/itemProps1.xml><?xml version="1.0" encoding="utf-8"?>
+<ds:datastoreItem xmlns:ds="http://schemas.openxmlformats.org/officeDocument/2006/customXml" ds:itemID="{917F256B-565E-47B7-8D78-F09DA8F1181A}">
+  <ds:schemaRefs>
+    <ds:schemaRef ds:uri="http://schemas.microsoft.com/office/2006/metadata/properties"/>
+    <ds:schemaRef ds:uri="http://schemas.microsoft.com/office/infopath/2007/PartnerControls"/>
+    <ds:schemaRef ds:uri="8b9e189a-44c8-475e-b768-20dcf1967d90"/>
+  </ds:schemaRefs>
+</ds:datastoreItem>
 </file>
 
-<file path=customXml/item3.xml><?xml version="1.0" encoding="utf-8"?>
-<p:properties xmlns:p="http://schemas.microsoft.com/office/2006/metadata/properties" xmlns:xsi="http://www.w3.org/2001/XMLSchema-instance" xmlns:pc="http://schemas.microsoft.com/office/infopath/2007/PartnerControls">
-  <documentManagement>
-    <_activity xmlns="8b9e189a-44c8-475e-b768-20dcf1967d90" xsi:nil="true"/>
-  </documentManagement>
-</p:properties>
+<file path=customXml/itemProps2.xml><?xml version="1.0" encoding="utf-8"?>
+<ds:datastoreItem xmlns:ds="http://schemas.openxmlformats.org/officeDocument/2006/customXml" ds:itemID="{4F980BC9-043D-4776-8709-AE1DD754E446}">
+  <ds:schemaRefs>
+    <ds:schemaRef ds:uri="http://schemas.microsoft.com/sharepoint/v3/contenttype/forms"/>
+  </ds:schemaRefs>
+</ds:datastoreItem>
 </file>
 
-<file path=customXml/itemProps1.xml><?xml version="1.0" encoding="utf-8"?>
+<file path=customXml/itemProps3.xml><?xml version="1.0" encoding="utf-8"?>
 <ds:datastoreItem xmlns:ds="http://schemas.openxmlformats.org/officeDocument/2006/customXml" ds:itemID="{E12F9948-0A5E-46BD-A2D8-6FE8D84181A2}">
   <ds:schemaRefs>
     <ds:schemaRef ds:uri="http://schemas.microsoft.com/office/2006/metadata/contentType"/>
@@ -3349,22 +3249,4 @@
     <ds:schemaRef ds:uri="http://schemas.microsoft.com/internal/obd"/>
   </ds:schemaRefs>
 </ds:datastoreItem>
-</file>
-
-<file path=customXml/itemProps2.xml><?xml version="1.0" encoding="utf-8"?>
-<ds:datastoreItem xmlns:ds="http://schemas.openxmlformats.org/officeDocument/2006/customXml" ds:itemID="{4F980BC9-043D-4776-8709-AE1DD754E446}">
-  <ds:schemaRefs>
-    <ds:schemaRef ds:uri="http://schemas.microsoft.com/sharepoint/v3/contenttype/forms"/>
-  </ds:schemaRefs>
-</ds:datastoreItem>
-</file>
-
-<file path=customXml/itemProps3.xml><?xml version="1.0" encoding="utf-8"?>
-<ds:datastoreItem xmlns:ds="http://schemas.openxmlformats.org/officeDocument/2006/customXml" ds:itemID="{917F256B-565E-47B7-8D78-F09DA8F1181A}">
-  <ds:schemaRefs>
-    <ds:schemaRef ds:uri="http://schemas.microsoft.com/office/2006/metadata/properties"/>
-    <ds:schemaRef ds:uri="http://schemas.microsoft.com/office/infopath/2007/PartnerControls"/>
-    <ds:schemaRef ds:uri="8b9e189a-44c8-475e-b768-20dcf1967d90"/>
-  </ds:schemaRefs>
-</ds:datastoreItem>
 </file>
</xml_diff>